<commit_message>
Bring the Test Plan up to date with the customer review round
Section 13 still described the state on 11 August: 53 test cases, 32 defects,
and no mention of the customer having seen the system at all. It now reads 59
cases across 14 modules and 38 defects, and records Customer Testing Round 1
as its own discovery category.

That distinction is the point of the edit rather than the numbers. Six of the
38 defects came from the customer, and a reader who cannot tell review findings
from live-operation failures would draw a much worse conclusion about the
system than the evidence supports. The wording now says plainly that none were
found in operation, because it is not yet deployed.

Version 1.2.

Co-Authored-By: Claude Opus 5 <noreply@anthropic.com>
</commit_message>
<xml_diff>
--- a/docs/Software_Test_Plan.docx
+++ b/docs/Software_Test_Plan.docx
@@ -102,7 +102,7 @@
           <w:sz w:val="22"/>
           <w:szCs w:val="22"/>
         </w:rPr>
-        <w:t xml:space="preserve">Version: 1.1  |  Date: 11 August 2026</w:t>
+        <w:t xml:space="preserve">Version: 1.2  |  Date: 18 August 2026</w:t>
       </w:r>
     </w:p>
     <w:p>
@@ -1977,20 +1977,20 @@
         <w:spacing w:after="80"/>
       </w:pPr>
       <w:r>
-        <w:t xml:space="preserve">Test Case Matrix (Test_Case_Matrix.xlsx) — 53 test cases across 13 functional modules, each tagged with the test design technique used and a priority level.</w:t>
-      </w:r>
-    </w:p>
-    <w:p>
-      <w:pPr>
-        <w:pStyle w:val="ListParagraph"/>
-        <w:numPr>
-          <w:ilvl w:val="0"/>
-          <w:numId w:val="2"/>
-        </w:numPr>
-        <w:spacing w:after="80"/>
-      </w:pPr>
-      <w:r>
-        <w:t xml:space="preserve">Defect Log (Defect_Log.xlsx) — 32 logged defects spanning five code review rounds and three user acceptance testing rounds, with severity, priority, root cause, and resolution recorded for each.</w:t>
+        <w:t xml:space="preserve">Test Case Matrix (Test_Case_Matrix.xlsx) — 59 test cases across 14 functional modules, each tagged with the test design technique used and a priority level.</w:t>
+      </w:r>
+    </w:p>
+    <w:p>
+      <w:pPr>
+        <w:pStyle w:val="ListParagraph"/>
+        <w:numPr>
+          <w:ilvl w:val="0"/>
+          <w:numId w:val="2"/>
+        </w:numPr>
+        <w:spacing w:after="80"/>
+      </w:pPr>
+      <w:r>
+        <w:t xml:space="preserve">Defect Log (Defect_Log.xlsx) — 38 logged defects spanning five code review rounds, three user acceptance testing rounds and one customer review round, with severity, priority, root cause, and resolution recorded for each.</w:t>
       </w:r>
     </w:p>
     <w:p>
@@ -2011,7 +2011,7 @@
         <w:spacing w:after="80"/>
       </w:pPr>
       <w:r>
-        <w:t xml:space="preserve">All 32 logged defects are Fixed and none remain Open.</w:t>
+        <w:t xml:space="preserve">All 38 logged defects are Fixed and none remain Open. The last two to carry a qualifier, DEF-009 and DEF-010, were closed once the full matrix run re-exercised them.</w:t>
       </w:r>
     </w:p>
     <w:p>
@@ -2037,7 +2037,7 @@
         <w:spacing w:after="80"/>
       </w:pPr>
       <w:r>
-        <w:t xml:space="preserve">The Test Case Matrix has since been executed end-to-end against the current build: all 53 cases are recorded Pass, each with its Actual Result, Tester, and Date. DEF-031 and DEF-032 were surfaced by that run and were fixed and re-verified within it. TC-049 to TC-052 cover the reworked suggestion lists that closed DEF-030, and TC-053 the in-place upgrade of a database created by an earlier build, which closed DEF-021. Throughout, results were checked against the stored rows rather than against the screen alone.</w:t>
+        <w:t xml:space="preserve">The Test Case Matrix has been executed end-to-end against the current build: all 59 cases are recorded Pass, each with its Actual Result, Tester, and Date. TC-049 to TC-052 cover the reworked suggestion lists that closed DEF-030, and TC-053 the in-place upgrade of a database created by an earlier build, which closed DEF-021. Throughout, results were checked against the stored rows rather than against the screen alone.</w:t>
       </w:r>
     </w:p>
     <w:tbl>
@@ -2095,7 +2095,7 @@
                 <w:sz w:val="22"/>
                 <w:szCs w:val="22"/>
               </w:rPr>
-              <w:t xml:space="preserve">Every test case is executed and every defect is closed, so the loop between planning, testing, and defect tracking that this document describes is complete. The one item still outstanding is thermal printer testing, which cannot begin until the hardware is purchased and is recorded as out of scope in Section 2.2. Any change made from here re-runs the affected Test Case Matrix rows, and any failure becomes a new Defect Log entry.</w:t>
+              <w:t xml:space="preserve">A first round of customer review has since been completed. It is recorded in the Defect Log as Customer Testing Round 1, deliberately distinguished from defects found in live operation, of which there have been none because the system is not yet deployed. That round produced six entries, DEF-033 to DEF-038: a multi-copy arrangement fixed to one orientation, PDF output that arrived unnamed, a company logo that could not travel to another machine, a cancelled save that nonetheless marked a slip printed, an overlapping Printer Settings layout, and a landscape setting that rotated the paper without rotating the content. TC-054 to TC-059 cover them and all six are closed. Every test case is executed and every defect is closed, so the loop between planning, testing, and defect tracking that this document describes is complete. The one item still outstanding is thermal printer testing, which cannot begin until the hardware is purchased and is recorded as out of scope in Section 2.2. Any change made from here re-runs the affected Test Case Matrix rows, and any failure becomes a new Defect Log entry.</w:t>
             </w:r>
           </w:p>
         </w:tc>

</xml_diff>